<commit_message>
feat(cv): eliminar la sección de proyectos de las cuatro variantes
Solo contenía la infraestructura de Hermes Agent, que es software de
terceros (Nous Research) y no un proyecto propio. El tipo CvContent pasa
a tener `projects` opcional y la maqueta no pinta la sección si falta.

Regenerados los 4 PDF (1 página, Tagged) y los 4 .docx maestros.
</commit_message>
<xml_diff>
--- a/assets/real/Jean-Bravo-CV-EN-Spain.docx
+++ b/assets/real/Jean-Bravo-CV-EN-Spain.docx
@@ -1,6 +1,6 @@
 
 <file path=word/document.xml><?xml version="1.0" encoding="utf-8"?>
-<w:document xmlns:wpc="http://schemas.microsoft.com/office/word/2010/wordprocessingCanvas" xmlns:mo="http://schemas.microsoft.com/office/mac/office/2008/main" xmlns:mc="http://schemas.openxmlformats.org/markup-compatibility/2006" xmlns:mv="urn:schemas-microsoft-com:mac:vml" xmlns:o="urn:schemas-microsoft-com:office:office" xmlns:r="http://schemas.openxmlformats.org/officeDocument/2006/relationships" xmlns:m="http://schemas.openxmlformats.org/officeDocument/2006/math" xmlns:v="urn:schemas-microsoft-com:vml" xmlns:wp14="http://schemas.microsoft.com/office/word/2010/wordprocessingDrawing" xmlns:wp="http://schemas.openxmlformats.org/drawingml/2006/wordprocessingDrawing" xmlns:w10="urn:schemas-microsoft-com:office:word" xmlns:w="http://schemas.openxmlformats.org/wordprocessingml/2006/main" xmlns:w14="http://schemas.microsoft.com/office/word/2010/wordml" xmlns:wpg="http://schemas.microsoft.com/office/word/2010/wordprocessingGroup" xmlns:wpi="http://schemas.microsoft.com/office/word/2010/wordprocessingInk" xmlns:wne="http://schemas.microsoft.com/office/word/2006/wordml" xmlns:wps="http://schemas.microsoft.com/office/word/2010/wordprocessingShape" mc:Ignorable="w14 wp14">
+<w:document xmlns:ns1="http://schemas.openxmlformats.org/markup-compatibility/2006" xmlns:w="http://schemas.openxmlformats.org/wordprocessingml/2006/main" ns1:Ignorable="w14 wp14">
   <w:body>
     <w:p>
       <w:r>
@@ -187,56 +187,6 @@
       </w:pPr>
       <w:r>
         <w:t>GCP deployments and cross-functional teamwork using Jira.</w:t>
-      </w:r>
-    </w:p>
-    <w:p>
-      <w:r>
-        <w:rPr>
-          <w:b/>
-          <w:color w:val="1F4E79"/>
-          <w:sz w:val="22"/>
-        </w:rPr>
-        <w:t>PROJECTS</w:t>
-      </w:r>
-    </w:p>
-    <w:p>
-      <w:r>
-        <w:rPr>
-          <w:b/>
-        </w:rPr>
-        <w:t>Hermes Agent Infrastructure — self-hosted AI agent stack  —  2026 – Present</w:t>
-      </w:r>
-    </w:p>
-    <w:p>
-      <w:r>
-        <w:rPr>
-          <w:b/>
-        </w:rPr>
-        <w:t>Personal</w:t>
-      </w:r>
-    </w:p>
-    <w:p>
-      <w:pPr>
-        <w:pStyle w:val="ListBullet"/>
-      </w:pPr>
-      <w:r>
-        <w:t>Deployed and operate a 24/7 self-hosted AI agent (Hermes Agent, open source by Nous Research) on Oracle Cloud ARM64 — Docker, systemd, Cloudflare Tunnel, ~$5/month total cost.</w:t>
-      </w:r>
-    </w:p>
-    <w:p>
-      <w:pPr>
-        <w:pStyle w:val="ListBullet"/>
-      </w:pPr>
-      <w:r>
-        <w:t>Persistent semantic memory with self-hosted Mem0 + Qdrant vector DB (hybrid semantic + keyword search); multi-model LLM routing via OpenRouter with automatic fallbacks across ~20 providers.</w:t>
-      </w:r>
-    </w:p>
-    <w:p>
-      <w:pPr>
-        <w:pStyle w:val="ListBullet"/>
-      </w:pPr>
-      <w:r>
-        <w:t>Cloud browser automation (Browser Use API), multi-platform messaging gateway (Telegram, Slack) and cron-based scheduled automation.</w:t>
       </w:r>
     </w:p>
     <w:p>

</xml_diff>